<commit_message>
fix: label circle prompts and Hochman activities as 'Suggested'
Teachers should have flexibility to adapt these — changed headings from
"Opening Circle" to "Suggested Opening Circle" and "Hochman Writing
Integration" to "Suggested Hochman Writing Activity" in all lesson plans.

Co-Authored-By: Claude Opus 4.6 <noreply@anthropic.com>
</commit_message>
<xml_diff>
--- a/Chemistry/Templates/Lesson Plan Template.docx
+++ b/Chemistry/Templates/Lesson Plan Template.docx
@@ -60,7 +60,7 @@
           <w:sz w:val="24"/>
           <w:u w:val="none"/>
         </w:rPr>
-        <w:t>Opening Circle (2-3 min)</w:t>
+        <w:t>Suggested Opening Circle (2-3 min)</w:t>
       </w:r>
     </w:p>
     <w:p>
@@ -77,7 +77,7 @@
           <w:sz w:val="22"/>
           <w:u w:val="none"/>
         </w:rPr>
-        <w:t xml:space="preserve">Community Prompt: </w:t>
+        <w:t xml:space="preserve">Suggested Community Prompt: </w:t>
       </w:r>
       <w:r>
         <w:rPr>
@@ -929,7 +929,7 @@
           <w:sz w:val="24"/>
           <w:u w:val="none"/>
         </w:rPr>
-        <w:t>Hochman Writing Integration</w:t>
+        <w:t>Suggested Hochman Writing Activity</w:t>
       </w:r>
     </w:p>
     <w:p>
@@ -946,7 +946,7 @@
           <w:sz w:val="22"/>
           <w:u w:val="none"/>
         </w:rPr>
-        <w:t xml:space="preserve">Literacy Activity: </w:t>
+        <w:t xml:space="preserve">Suggested Literacy Activity: </w:t>
       </w:r>
       <w:r>
         <w:rPr>

</xml_diff>